<commit_message>
Update books: page-join corrections and new PDF and Word downloads
</commit_message>
<xml_diff>
--- a/books/apocalypse/downloads/apocalypse.docx
+++ b/books/apocalypse/downloads/apocalypse.docx
@@ -3885,7 +3885,7 @@
         <w:rPr>
           <w:lang w:val="en-GB"/>
         </w:rPr>
-        <w:t xml:space="preserve">, I suspect, was the difficulty then, and has been ever since. It took, we shall find, different forms. Now, the confession of a Son of Man could become a mere hard, outward, almost material confession. Now, the confession of a Spirit could be turned into the excuse for all lawlessness and fanaticism. Therefore that every message should begin with one of these revelations and end with the other, is, I conceive, very significant, and one of the great reasons why we feel that in reading of the Asiatic Churches of eighteen centuries ago, we are reading of the European Churches in the midst of which we are dwelling.</w:t>
+        <w:t xml:space="preserve">, I suspect, was the difficulty then, and has been ever since. It took, we shall find, different forms. Now, the confession of a Son of a Man could become a mere hard, outward, almost material confession. Now, the confession of a Spirit could be turned into the excuse for all lawlessness and fanaticism. Therefore that every message should begin with one of these revelations and end with the other, is, I conceive, very significant, and one of the great reasons why we feel that in reading of the Asiatic Churches of eighteen centuries ago, we are reading of the European Churches in the midst of which we are dwelling.</w:t>
       </w:r>
     </w:p>
     <w:p>
@@ -26038,7 +26038,7 @@
         <w:rPr>
           <w:lang w:val="en-GB"/>
         </w:rPr>
-        <w:t xml:space="preserve">You see how, in this act of adoration, heaven and earth inevitably met together; how impossible it was for St. Paul to enter into the glory of the higher, without seeing anew glory resting upon the lower. And it was an earth, in which there was</w:t>
+        <w:t xml:space="preserve">You see how, in this act of adoration, heaven and earth inevitably met together; how impossible it was for St. Paul to enter into the glory of the higher, without seeing a new glory resting upon the lower. And it was an earth, in which there was</w:t>
       </w:r>
       <w:r>
         <w:rPr>

</xml_diff>

<commit_message>
Update books: corrections, EPUB covers, paraphrase EPUBs
</commit_message>
<xml_diff>
--- a/books/apocalypse/downloads/apocalypse.docx
+++ b/books/apocalypse/downloads/apocalypse.docx
@@ -3500,7 +3500,7 @@
         <w:rPr>
           <w:lang w:val="en-GB"/>
         </w:rPr>
-        <w:t xml:space="preserve">Unto the angel of the church of Ephesus write; These things saith he that holdeth the seven stars in his right hand, who walketh in the midst of the seven golden candlesticks; I know thy works, and thy labour, and thy patience, and how thou canst not bear them which are evil: and thou hast tried them which say they are apostles, and are not, and hast found them liars; and hast borne, and hast patience, and for my name’s sake hast laboured, and hast not fainted. Nevertheless I have somewhat against thee, because thou hast left thy first love. Remember therefore from whence thou art fallen, and repent, and do the first works; or else I will come unto thee quickly, and will remove thy candlestick out of his place, except thou repent. But this thou hast, that thou hatest the deeds of the Nicolaitanes, which I also hate. He that hath an ear, let him hear what the Spirit saith unto the churches; To him that overcometh will I give to eat of the tree of life, which is in the midst of the paradise of God. And unto the angel of the church in Smyrna write; These things saith the first and the last, which was dead, and is alive; I know thy works, and tribulation, and poverty (but thou art rich), and I know the blasphemy of them which say they are Jews, and are not, but are of the synagogue of Satan. Fear none of those things which thou shalt suffer: behold, the devil shall cast some of you into prison, that ye may be tried; and ye shall have tribulation ten days; be thou faithful unto death, and I will give thee a crown of life. He that hath an ear, let him hear what the Spirit saith unto the churches; He that overcometh shall not be hurt of the second death. And to the angel of the church in Pergamos write; These things saith he which hath the sharp sword with two edges; I know thy works, and where thou dwellest, even where Satan’s seat is: and thou holdest fast my name, and hast not denied my faith, even in those days wherein Antipas was my faithful martyr, who was slain among you, where Satan dwelleth. But I have a few things against thee, because thou hast there them that hold the doctrine of Balaam, who taught Balac to cast a stumbling-block before the children of Israel, to eat things sacrificed unto idols, and to commit fornication. So hast thou also them that hold the doctrine of the Nicolaitanes, which thing I hate. Repent; or else I will come unto thee quickly, and will fight against them with the sword of my mouth. He that hath an ear, let him hear what the Spirit saith unto the churches; To him that overcometh will I give to eat of the hidden manna, and will give him a white stone, and in the stone a new name written, which no man knoweth saving he that receiveth it. And unto the angel of the church in Thyatira write: These things saith the Son of God, who hath his eyes like unto a flame of fire, and his feet are like fine brass; I know thy works, and charity, and service, and faith, and thy patience, and thy works; and the last to be more than the first. Notwithstanding I have a few things against thee because thou sufferest that woman Jezebel, which calleth herself a prophetess, to teach and to seduce my servants to commit fornication, and to eat things sacrificed unto idols. And I gave her space to repent of her fornication; and she repented not. Behold, I will cast her into a bed, and them that commit adultery with her into great tribulation, except they repent of their deeds. And I will kill her children with death; and all the churches shall know that I am he which searcheth the reins and hearts: and I will give unto every one of you according to your works. But unto you I say, and unto the rest in Thyatira, as many as have not this doctrine, and which have not known the depths of Satan, as they speak; I will put upon you none other burden. But that which ye have already hold fast till I come. And he that overcometh, and keepeth my works until the end, to him will I give power over the nations: and he shall rule them with a rod of iron; as the vessels of a potter shall they be broken to shivers: even as I received of my Father. And I will give him the morning star. He that hath an ear, let him hear what the Spirit saith unto the churches. And unto the angel of the church in Sardis write: These things saith he that hath the seven Spirits of God, and the seven stars; I know thy works, that thou hast a name that thou livest, and art dead. Be watchful, and strengthen the things which remain, that are ready to die; for I have not found thy works perfect before God. Remember therefore how thou hast received and heard, and hold fast, and repent. If therefore thou shalt not watch, I will come on thee as the thief, and thou shalt not know what hour I will come upon thee. Thou hast a few names even in Sardis which have not defiled their garments; and they shall walk with me in white: for they are worthy. He that overcometh, the same shall be clothed in white raiment; and I will not blot out his name out of the book of life, but I will confess his name before my Father, and before his angels. He that hath an ear let him hear what the Spirit saith unto the churches. And to the angel of the church of Philadelphia write: These things saith he that is holy, he that is true, he that hath the key of David, he that openeth, and no man shutteth; and shutteth, and no man openeth; I know thy works; behold, I have set before thee an open door, and no man can shut it; for thou hast a little strength, and hast kept my word, and hast not denied my name. Behold, I will make them of the synagogue of Satan, which say they are Jews, and are not, but do lie; behold, I will make them to come and worship before thy feet, and to know that I have loved thee. Because thou hast kept the word of my patience, I also will keep thee from the hour of temptation, which shall come upon all the world, to try them that dwell upon the earth. Behold, I come quickly: hold that fast which thou hast, that no man take thy crown. Him that overcometh will I make a pillar in the temple of my God, and he shall go no more out: and I will write upon him the name of my God, and the name of the city of my God, which is new Jerusalem, which cometh down out of heaven from my God: and I will write upon him my new name. He that hath an ear, let him hear what the Spirit saith unto the churches. And unto the angel of the church of the Laodiceans write; These things saith the Amen, the faithful and true witness, the beginning of the creation of God; I know thy works, that thou art neither cold nor hot: I would thou wert cold or hot. So then because thou art lukewarm, and neither cold nor hot, I will spue thee out of my mouth. Because thou sayest, I am rich, and increased with goods, and have need of nothing; and knowest not that thou art wretched, and miserable, and poor, and blind, and naked; I counsel thee to buy of me gold tried in the fire, that thou mayest be rich; and white raiment, that thou mayest be clothed, and that the shame of thy nakedness do not appear; and anoint thine eyes with eyesalve, that thou mayest see. As many as I love, I rebuke and chasten: be zealous therefore, and repent. Behold, I stand at the door, and knock: if any man hear my voice, and open the door, I will come in to him, and will sup with him, and he with me. To him that overcometh, will I grant to sit with me in my throne, even as I also overcame, and am set down with my Father in his throne. He that hath an ear, let him hear what the Spirit saith unto the churches.</w:t>
+        <w:t xml:space="preserve">Unto the angel of the church of Ephesus write; These things saith he that holdeth the seven stars in his right hand, who walketh in the midst of the seven golden candlesticks; I know thy works, and thy labour, and thy patience, and how thou canst not bear them which are evil: and thou hast tried them which say they are apostles, and are not, and hast found them liars; and hast borne, and hast patience, and for my name’s sake hast laboured, and hast not fainted. Nevertheless I have somewhat against thee, because thou hast left thy first love. Remember therefore from whence thou art fallen, and repent, and do the first works; or else I will come unto thee quickly, and will remove thy candlestick out of his place, except thou repent. But this thou hast, that thou hatest the deeds of the Nicolaitanes, which I also hate. He that hath an ear, let him hear what the Spirit saith unto the churches; To him that overcometh will I give to eat of the tree of life, which is in the midst of the paradise of God. And unto the angel of the church in Smyrna write; These things saith the first and the last, which was dead, and is alive; I know thy works, and tribulation, and poverty (but thou art rich), and I know the blasphemy of them which say they are Jews, and are not, but are of the synagogue of Satan. Fear none of those things which thou shalt suffer: behold, the devil shall cast some of you into prison, that ye may be tried; and ye shall have tribulation ten days; be thou faithful unto death, and I will give thee a crown of life. He that hath an ear, let him hear what the Spirit saith unto the churches; He that overcometh shall not be hurt of the second death. And to the angel of the church in Pergamos write; These things saith he which hath the sharp sword with two edges; I know thy works, and where thou dwellest, even where Satan’s seat is: and thou holdest fast my name, and hast not denied my faith, even in those days wherein Antipas was my faithful martyr, who was slain among you, where Satan dwelleth. But I have a few things against thee, because thou hast there them that hold the doctrine of Balaam, who taught Balac to cast a stumbling-block before the children of Israel, to eat things sacrificed unto idols, and to commit fornication. So hast thou also them that hold the doctrine of the Nicolaitanes, which thing I hate. Repent; or else I will come unto thee quickly, and will fight against them with the sword of my mouth. He that hath an ear, let him hear what the Spirit saith unto the churches; To him that overcometh will I give to eat of the hidden manna, and will give him a white stone, and in the stone a new name written, which no man knoweth saving he that receiveth it. And unto the angel of the church in Thyatira write; These things saith the Son of God, who hath his eyes like unto a flame of fire, and his feet are like fine brass; I know thy works, and charity, and service, and faith, and thy patience, and thy works; and the last to be more than the first. Notwithstanding I have a few things against thee because thou sufferest that woman Jezebel, which calleth herself a prophetess, to teach and to seduce my servants to commit fornication, and to eat things sacrificed unto idols. And I gave her space to repent of her fornication; and she repented not. Behold, I will cast her into a bed, and them that commit adultery with her into great tribulation, except they repent of their deeds. And I will kill her children with death; and all the churches shall know that I am he which searcheth the reins and hearts: and I will give unto every one of you according to your works. But unto you I say, and unto the rest in Thyatira, as many as have not this doctrine, and which have not known the depths of Satan, as they speak; I will put upon you none other burden. But that which ye have already hold fast till I come. And he that overcometh, and keepeth my works until the end, to him will I give power over the nations: and he shall rule them with a rod of iron; as the vessels of a potter shall they be broken to shivers: even as I received of my Father. And I will give him the morning star. He that hath an ear, let him hear what the Spirit saith unto the churches. And unto the angel of the church in Sardis write: These things saith he that hath the seven Spirits of God, and the seven stars; I know thy works, that thou hast a name that thou livest, and art dead. Be watchful, and strengthen the things which remain, that are ready to die; for I have not found thy works perfect before God. Remember therefore how thou hast received and heard, and hold fast, and repent. If therefore thou shalt not watch, I will come on thee as the thief, and thou shalt not know what hour I will come upon thee. Thou hast a few names even in Sardis which have not defiled their garments; and they shall walk with me in white: for they are worthy. He that overcometh, the same shall be clothed in white raiment; and I will not blot out his name out of the book of life, but I will confess his name before my Father, and before his angels. He that hath an ear let him hear what the Spirit saith unto the churches. And to the angel of the church of Philadelphia write; These things saith he that is holy, he that is true, he that hath the key of David, he that openeth, and no man shutteth; and shutteth, and no man openeth; I know thy works; behold, I have set before thee an open door, and no man can shut it; for thou hast a little strength, and hast kept my word, and hast not denied my name. Behold, I will make them of the synagogue of Satan, which say they are Jews, and are not, but do lie; behold, I will make them to come and worship before thy feet, and to know that I have loved thee. Because thou hast kept the word of my patience, I also will keep thee from the hour of temptation, which shall come upon all the world, to try them that dwell upon the earth. Behold, I come quickly: hold that fast which thou hast, that no man take thy crown. Him that overcometh will I make a pillar in the temple of my God, and he shall go no more out: and I will write upon him the name of my God, and the name of the city of my God, which is new Jerusalem, which cometh down out of heaven from my God: and I will write upon him my new name. He that hath an ear, let him hear what the Spirit saith unto the churches. And unto the angel of the church of the Laodiceans write; These things saith the Amen, the faithful and true witness, the beginning of the creation of God; I know thy works, that thou art neither cold nor hot: I would thou wert cold or hot. So then because thou art lukewarm, and neither cold nor hot, I will spue thee out of my mouth. Because thou sayest, I am rich, and increased with goods, and have need of nothing; and knowest not that thou art wretched, and miserable, and poor, and blind, and naked; I counsel thee to buy of me gold tried in the fire, that thou mayest be rich; and white raiment, that thou mayest be clothed, and that the shame of thy nakedness do not appear; and anoint thine eyes with eyesalve, that thou mayest see. As many as I love, I rebuke and chasten: be zealous therefore, and repent. Behold, I stand at the door, and knock: if any man hear my voice, and open the door, I will come in to him, and will sup with him, and he with me. To him that overcometh, will I grant to sit with me in my throne, even as I also overcame, and am set down with my Father in his throne. He that hath an ear, let him hear what the Spirit saith unto the churches.</w:t>
       </w:r>
     </w:p>
     <w:p>
@@ -17917,54 +17917,79 @@
     </w:p>
     <w:p>
       <w:pPr>
+        <w:pStyle w:val="Centered"/>
+      </w:pPr>
+      <w:r>
+        <w:rPr>
+          <w:lang w:val="en-GB"/>
+        </w:rPr>
+        <w:t xml:space="preserve">(PREACHED ON WHITSUNDAY.)</w:t>
+      </w:r>
+    </w:p>
+    <w:p>
+      <w:pPr>
+        <w:pStyle w:val="BlockText"/>
+      </w:pPr>
+      <w:r>
+        <w:rPr>
+          <w:lang w:val="en-GB"/>
+        </w:rPr>
+        <w:t xml:space="preserve">And I looked, and, lo, a Lamb stood on the Mount Sion, and with him an hundred forty and four thousand, having his Father’s name written in their foreheads. And I heard a voice from heaven, as the voice of many waters, and as the voice of a great thunder: and I heard the voice of harpers harping with their harps: and they sung as it were a new song before the throne, and before the four beasts, and the elders: and no man could learn that song but the hundred and forty and four thousand which were redeemed from the earth. These are they which were not defiled with women; for they are virgins. These are they which follow the Lamb whithersoever he goeth. These were redeemed from among men, being the firstfruits unto God and to the Lamb. And in their mouth was found no guile: for they are without fault before the throne of God. And I saw another angel fly in the midst of heaven, having the everlasting gospel to preach unto them that dwell on the earth, and to every nation, and kindred, and tongue, and people, saying with a loud voice, Fear God, and give glory to him; for the hour of his judgment is come: and worship him that made heaven, and earth, and the sea, and the fountains of waters. And there followed another angel, saying, Babylon is fallen, is fallen, that great city, because she made all nations drink of the wine of the wrath of her fornication. And the third angel followed them, saying with a loud voice, If any man worship the beast and his image, and receive his mark in his forehead, or in his hand, the same shall drink of the wine of the wrath of God, which is poured out without mixture into the cup of his indignation; and he shall be tormented with fire and brimstone in the presence of the holy angels, and in the presence of the Lamb: and the smoke of their torment ascendeth up for ever and ever: and they have no rest day nor night, who worship the beast and his image, and whosoever receiveth the mark of his name. Here is the patience of the saints: here are they that keep the commandments of God, and the faith of Jesus. And I heard a voice from heaven saying unto me, Write, Blessed are the dead which die in the Lord from henceforth: Yea, saith the Spirit, that they may rest from their labours; and their works do follow them.—</w:t>
+      </w:r>
+      <w:r>
+        <w:rPr>
+          <w:smallCaps/>
+          <w:lang w:val="en-GB"/>
+        </w:rPr>
+        <w:t xml:space="preserve">Rev.</w:t>
+      </w:r>
+      <w:r>
+        <w:rPr>
+          <w:lang w:val="en-GB"/>
+        </w:rPr>
+        <w:t xml:space="preserve"> </w:t>
+      </w:r>
+      <w:r>
+        <w:rPr>
+          <w:lang w:val="en-GB"/>
+        </w:rPr>
+        <w:t xml:space="preserve">xiv. 1-14.</w:t>
+      </w:r>
+    </w:p>
+    <w:p>
+      <w:pPr>
         <w:pStyle w:val="FirstParagraph"/>
       </w:pPr>
       <w:r>
         <w:rPr>
           <w:lang w:val="en-GB"/>
         </w:rPr>
-        <w:t xml:space="preserve">(PREACHED ON WHITSUNDAY.)</w:t>
-      </w:r>
-    </w:p>
-    <w:p>
-      <w:pPr>
-        <w:pStyle w:val="BlockText"/>
-      </w:pPr>
-      <w:r>
-        <w:rPr>
-          <w:lang w:val="en-GB"/>
-        </w:rPr>
-        <w:t xml:space="preserve">And I looked, and, lo, a Lamb stood on the Mount Sion, and with him an hundred forty and four thousand, having his Father’s name written in their foreheads. And I heard a voice from heaven, as the voice of many waters, and as the voice of a great thunder: and I heard the voice of harpers harping with their harps: and they sung as it were a new song before the throne, and before the four beasts, and the elders: and no man could learn that song but the hundred and forty and four thousand which were redeemed from the earth. These are they which were not defiled with women; for they are virgins. These are they which follow the Lamb whithersoever he goeth. These were redeemed from among men, being the firstfruits unto God and to the Lamb. And in their mouth was found no guile: for they are without fault before the throne of God. And I saw another angel fly in the midst of heaven, having the everlasting gospel to preach unto them that dwell on the earth, and to every nation, and kindred, and tongue, and people, saying with a loud voice, Fear God, and give glory to him; for the hour of his judgment is come: and worship him that made heaven, and earth, and the sea, and the fountains of waters. And there followed another angel, saying, Babylon is fallen, is fallen, that great city, because she made all nations drink of the wine of the wrath of her fornication. And the third angel followed them, saying with a loud voice, If any man worship the beast and his image, and receive his mark in his forehead, or in his hand, the same shall drink of the wine of the wrath of God, which is poured out without mixture into the cup of his indignation; and he shall be tormented with fire and brimstone in the presence of the holy angels, and in the presence of the Lamb: and the smoke of their torment ascendeth up for ever and ever: and they have no rest day nor night, who worship the beast and his image, and whosoever receiveth the mark of his name. Here is the patience of the saints: here are they that keep the commandments of God, and the faith of Jesus. And I heard a voice from heaven saying unto me, Write, Blessed are the dead which die in the Lord from henceforth: Yea, saith the Spirit, that they may rest from their labours; and their works do follow them.—</w:t>
+        <w:t xml:space="preserve">I.</w:t>
+      </w:r>
+      <w:r>
+        <w:rPr>
+          <w:lang w:val="en-GB"/>
+        </w:rPr>
+        <w:t xml:space="preserve"> </w:t>
       </w:r>
       <w:r>
         <w:rPr>
           <w:smallCaps/>
           <w:lang w:val="en-GB"/>
         </w:rPr>
-        <w:t xml:space="preserve">Rev.</w:t>
-      </w:r>
-      <w:r>
-        <w:rPr>
-          <w:lang w:val="en-GB"/>
-        </w:rPr>
-        <w:t xml:space="preserve"> </w:t>
-      </w:r>
-      <w:r>
-        <w:rPr>
-          <w:lang w:val="en-GB"/>
-        </w:rPr>
-        <w:t xml:space="preserve">xiv. 1-14.</w:t>
-      </w:r>
-    </w:p>
-    <w:p>
-      <w:pPr>
-        <w:pStyle w:val="FirstParagraph"/>
-      </w:pPr>
-      <w:r>
-        <w:rPr>
-          <w:lang w:val="en-GB"/>
-        </w:rPr>
-        <w:t xml:space="preserve">I. This vision recalls the one in the seventh chapter. When the angels were going forth with their trumpets to prepare for the fall of the accursed city, another angel was seen sealing twelve thousand of every tribe of Israel with the seal of the living God. The names of the tribes which were so carefully and formally enumerated there, do not appear again here. But the total number of the sealed is the same. The place Mount Sion connects them with the chosen people. There are, however, two new circumstances: these one hundred and forty-four thousand are about the Lamb, and they are signed with their Father’s name. I would especially call your attention to the resemblance between these visions, and to the difference between them, on this day. Whitsuntide, it seems to me, throws a clear light upon the whole subject, and in turn receives a light from the Apocalypse.</w:t>
+        <w:t xml:space="preserve">This</w:t>
+      </w:r>
+      <w:r>
+        <w:rPr>
+          <w:lang w:val="en-GB"/>
+        </w:rPr>
+        <w:t xml:space="preserve"> </w:t>
+      </w:r>
+      <w:r>
+        <w:rPr>
+          <w:lang w:val="en-GB"/>
+        </w:rPr>
+        <w:t xml:space="preserve">vision recalls the one in the seventh chapter. When the angels were going forth with their trumpets to prepare for the fall of the accursed city, another angel was seen sealing twelve thousand of every tribe of Israel with the seal of the living God. The names of the tribes which were so carefully and formally enumerated there, do not appear again here. But the total number of the sealed is the same. The place Mount Sion connects them with the chosen people. There are, however, two new circumstances: these one hundred and forty-four thousand are about the Lamb, and they are signed with their Father’s name. I would especially call your attention to the resemblance between these visions, and to the difference between them, on this day. Whitsuntide, it seems to me, throws a clear light upon the whole subject, and in turn receives a light from the Apocalypse.</w:t>
       </w:r>
     </w:p>
     <w:p>
@@ -25626,7 +25651,7 @@
         <w:rPr>
           <w:lang w:val="en-GB"/>
         </w:rPr>
-        <w:t xml:space="preserve">And I saw a new heaven and a new earth: for the first heaven and the first earth were passed away; and there was no more sea. And I John saw the holy city, new Jerusalem, coming down from God out of heaven, prepared as a bride adorned for her husband. And I heard a great voice out of heaven saying, Behold, the tabernacle of God is with men, and he will dwell with them, and they shall be his people, and God himself shall be with them, and be their God. And God shall wipe away all tears from their eyes: and there shall be no more death, neither sorrow nor crying, neither shall there be any more pain: for the former things are passed away. And he that sat upon the throne said, Behold, I make all things new. And he said unto me, Write: for these words are true and faithful. And he said unto me, It is done. I am Alpha and Omega, the beginning and the end. I will give unto him that is athirst of the fountain of the water of life freely. He that overcometh shall inherit all things; and I will be his God, and he shall be my son. But the fearful, and unbelieving, and the abominable, and murderers, and whoremongers, and sorcerers, and idolaters, and all liars, shall have their part in the lake which burneth with fire and brimstone: which is the second death. And there came unto me one of the seven angels which had the seven vials full of the seven last plagues, and talked with me, saying, Come hither, I will shew thee the bride, the Lamb’s wife. And he carried me away in the spirit to a great and high mountain, and shewed me that great city, the holy Jerusalem, descending out of heaven from God, having the glory of God: and her light was like unto a stone most precious, even like a jasper stone, clear as crystal; and had a wall great and high, and had twelve gates, and at the gates twelve angels, and names written thereon, which are the names of the twelve tribes of the children of Israel: on the east three gates; on the north three gates; on the south three gates; and on the west three gates. And the wall of the city had twelve foundations, and in them the names of the twelve apostles of the Lamb. And he that talked with me had a golden reed to measure the city, and the gates thereof, and the wall thereof. And the city lieth foursquare, and the length is as large as the breadth: and he measured the city with the reed, twelve thousand furlongs. The length and the breadth and the height of it are equal. And he measured the wall thereof, an hundred and forty and four cubits, according to the measure of a man, that is of the angel. And the building of the wall of it was of jasper: and the city was pure gold, like unto clear glass. And the foundations of the wall of the city were garnished with all manner of precious stones. The first foundation was jasper; the second, sapphire; the third, a chalcedony; the fourth, an emerald; the fifth, sardonyx; the sixth, sardius; the seventh, chrysolite; the eighth, beryl; the ninth, a topaz; the tenth, a chrysoprasus; the eleventh, a jacinth; the twelfth, an amethyst. And the twelve gates were twelve pearls; every several gate was of one pearl: and the street of the city was pure gold, as it were transparent glass. And I saw no temple therein: for the Lord God Almighty and the Lamb are the temple of it. And the city had no need of the sun, neither of the moon, to shine in it: for the glory of God did lighten it, and the Lamb is the light thereof. And the nations of them which are saved shall walk in the light of it: and the kings of the earth do bring their glory and honour into it. And the gates of it shall not be shut at all by day: for there shall be no night there. And they shall bring the glory and honour of the nations into it. And there shall in no wise enter into it any thing that defileth, neither whatsoever worketh abomination, or maketh a lie; but they which are written in the Lamb’s book of life.—</w:t>
+        <w:t xml:space="preserve">And I saw a new heaven and a new earth: for the first heaven and the first earth were passed away; and there was no more sea. And I John saw the holy city, new Jerusalem, coming down from God out of heaven, prepared as a bride adorned for her husband. And I heard a great voice out of heaven saying, Behold, the tabernacle of God is with men, and he will dwell with them, and they shall be his people, and God himself shall be with them, and be their God. And God shall wipe away all tears from their eyes; and there shall be no more death, neither sorrow nor crying, neither shall there be any more pain: for the former things are passed away. And he that sat upon the throne said, Behold, I make all things new. And he said unto me, Write: for these words are true and faithful. And he said unto me, It is done. I am Alpha and Omega, the beginning and the end. I will give unto him that is athirst of the fountain of the water of life freely. He that overcometh shall inherit all things; and I will be his God, and he shall be my son. But the fearful, and unbelieving, and the abominable, and murderers, and whoremongers, and sorcerers, and idolaters, and all liars, shall have their part in the lake which burneth with fire and brimstone: which is the second death. And there came unto me one of the seven angels which had the seven vials full of the seven last plagues, and talked with me, saying, Come hither, I will shew thee the bride, the Lamb’s wife. And he carried me away in the spirit to a great and high mountain, and shewed me that great city, the holy Jerusalem, descending out of heaven from God, having the glory of God: and her light was like unto a stone most precious, even like a jasper stone, clear as crystal; and had a wall great and high, and had twelve gates, and at the gates twelve angels, and names written thereon, which are the names of the twelve tribes of the children of Israel: on the east three gates; on the north three gates; on the south three gates; and on the west three gates. And the wall of the city had twelve foundations, and in them the names of the twelve apostles of the Lamb. And he that talked with me had a golden reed to measure the city, and the gates thereof, and the wall thereof. And the city lieth foursquare, and the length is as large as the breadth: and he measured the city with the reed, twelve thousand furlongs. The length and the breadth and the height of it are equal. And he measured the wall thereof, an hundred and forty and four cubits, according to the measure of a man, that is of the angel. And the building of the wall of it was of jasper: and the city was pure gold, like unto clear glass. And the foundations of the wall of the city were garnished with all manner of precious stones. The first foundation was jasper; the second, sapphire; the third, a chalcedony; the fourth, an emerald; the fifth, sardonyx; the sixth, sardius; the seventh, chrysolite; the eighth, beryl; the ninth, a topaz; the tenth, a chrysoprasus; the eleventh, a jacinth; the twelfth, an amethyst. And the twelve gates were twelve pearls; every several gate was of one pearl: and the street of the city was pure gold, as it were transparent glass. And I saw no temple therein: for the Lord God Almighty and the Lamb are the temple of it. And the city had no need of the sun, neither of the moon, to shine in it: for the glory of God did lighten it, and the Lamb is the light thereof. And the nations of them which are saved shall walk in the light of it: and the kings of the earth do bring their glory and honour into it. And the gates of it shall not be shut at all by day: for there shall be no night there. And they shall bring the glory and honour of the nations into it. And there shall in no wise enter into it any thing that defileth, neither whatsoever worketh abomination, or maketh a lie; but they which are written in the Lamb’s book of life.—</w:t>
       </w:r>
       <w:r>
         <w:rPr>
@@ -29426,6 +29451,7 @@
       <w:keepNext/>
       <w:keepLines/>
       <w:spacing w:after="80" w:before="160"/>
+      <w:jc w:val="center"/>
       <w:outlineLvl w:val="1"/>
     </w:pPr>
     <w:rPr>
@@ -29449,6 +29475,7 @@
       <w:keepNext/>
       <w:keepLines/>
       <w:spacing w:after="80" w:before="160"/>
+      <w:jc w:val="center"/>
       <w:outlineLvl w:val="2"/>
     </w:pPr>
     <w:rPr>

</xml_diff>